<commit_message>
Add Bill Krecji and Matt Fairchild to the Board of Directors
Expands the board from 3 to 5 directors (within the existing 3-9
range set by Article II) in the Bylaws (.txt and .docx) and the
Board of Directors roster in the Non-Profit Details file. The
original Articles of Incorporation filing record is left untouched
since it documents the board as actually submitted to the Illinois
Secretary of State in May 2026.
</commit_message>
<xml_diff>
--- a/OrgFiles/AmpliFi_Bylaws.docx
+++ b/OrgFiles/AmpliFi_Bylaws.docx
@@ -186,6 +186,89 @@
           <w:szCs w:val="20"/>
         </w:rPr>
         <w:t xml:space="preserve">Timothy Eavenson — Western Springs, IL</w:t>
+      </w:r>
+    </w:p>
+    <w:p>
+      <w:pPr>
+        <w:spacing w:after="60" w:before="60"/>
+      </w:pPr>
+      <w:r>
+        <w:rPr>
+          <w:rFonts w:ascii="Arial" w:cs="Arial" w:eastAsia="Arial" w:hAnsi="Arial"/>
+          <w:sz w:val="20"/>
+          <w:szCs w:val="20"/>
+        </w:rPr>
+        <w:t xml:space="preserve">Current Board (as of July 18, 2026):</w:t>
+      </w:r>
+    </w:p>
+    <w:p>
+      <w:pPr>
+        <w:spacing w:after="60" w:before="60"/>
+        <w:ind w:left="360"/>
+      </w:pPr>
+      <w:r>
+        <w:rPr>
+          <w:rFonts w:ascii="Arial" w:cs="Arial" w:eastAsia="Arial" w:hAnsi="Arial"/>
+          <w:sz w:val="20"/>
+          <w:szCs w:val="20"/>
+        </w:rPr>
+        <w:t xml:space="preserve">Joseph C. Grigsby — Western Springs, IL</w:t>
+      </w:r>
+    </w:p>
+    <w:p>
+      <w:pPr>
+        <w:spacing w:after="60" w:before="60"/>
+        <w:ind w:left="360"/>
+      </w:pPr>
+      <w:r>
+        <w:rPr>
+          <w:rFonts w:ascii="Arial" w:cs="Arial" w:eastAsia="Arial" w:hAnsi="Arial"/>
+          <w:sz w:val="20"/>
+          <w:szCs w:val="20"/>
+        </w:rPr>
+        <w:t xml:space="preserve">Nathan Young — Eudora, KS</w:t>
+      </w:r>
+    </w:p>
+    <w:p>
+      <w:pPr>
+        <w:spacing w:after="60" w:before="60"/>
+        <w:ind w:left="360"/>
+      </w:pPr>
+      <w:r>
+        <w:rPr>
+          <w:rFonts w:ascii="Arial" w:cs="Arial" w:eastAsia="Arial" w:hAnsi="Arial"/>
+          <w:sz w:val="20"/>
+          <w:szCs w:val="20"/>
+        </w:rPr>
+        <w:t xml:space="preserve">Timothy Eavenson — Western Springs, IL</w:t>
+      </w:r>
+    </w:p>
+    <w:p>
+      <w:pPr>
+        <w:spacing w:after="60" w:before="60"/>
+        <w:ind w:left="360"/>
+      </w:pPr>
+      <w:r>
+        <w:rPr>
+          <w:rFonts w:ascii="Arial" w:cs="Arial" w:eastAsia="Arial" w:hAnsi="Arial"/>
+          <w:sz w:val="20"/>
+          <w:szCs w:val="20"/>
+        </w:rPr>
+        <w:t xml:space="preserve">Bill Krecji</w:t>
+      </w:r>
+    </w:p>
+    <w:p>
+      <w:pPr>
+        <w:spacing w:after="60" w:before="60"/>
+        <w:ind w:left="360"/>
+      </w:pPr>
+      <w:r>
+        <w:rPr>
+          <w:rFonts w:ascii="Arial" w:cs="Arial" w:eastAsia="Arial" w:hAnsi="Arial"/>
+          <w:sz w:val="20"/>
+          <w:szCs w:val="20"/>
+        </w:rPr>
+        <w:t xml:space="preserve">Matt Fairchild</w:t>
       </w:r>
     </w:p>
     <w:p>

</xml_diff>